<commit_message>
Fix Hafiz Rashid name (Ch1), rename AC Malik Osman to Ramli Osman (Ch9/10/16), correct years of service, remove stale Ch8 marker
Co-Authored-By: Claude Sonnet 5.5 <noreply@anthropic.com>

Claude-Session: https://claude.ai/code/session_011sBVAmX35tPxqRASXqkfKn
</commit_message>
<xml_diff>
--- a/01_The_Blue_Silence/Manuscript/THE_BLUE_SILENCE_Chapter_01_The_Retirement.docx
+++ b/01_The_Blue_Silence/Manuscript/THE_BLUE_SILENCE_Chapter_01_The_Retirement.docx
@@ -38,7 +38,7 @@
     </w:p>
     <w:p>
       <w:r>
-        <w:t>Thirty years of service became twelve minutes behind a lectern.</w:t>
+        <w:t>Thirty-five years of service became twelve minutes behind a lectern.</w:t>
       </w:r>
     </w:p>
     <w:p>
@@ -583,7 +583,7 @@
     </w:p>
     <w:p>
       <w:r>
-        <w:t>Rahman had remembered the sentence for thirty-one years.</w:t>
+        <w:t>Rahman had remembered the sentence for thirty-five years.</w:t>
       </w:r>
     </w:p>
     <w:p>
@@ -1563,7 +1563,7 @@
     </w:p>
     <w:p>
       <w:r>
-        <w:t>Thirty years of instinct told him to say nothing.</w:t>
+        <w:t>Thirty-five years of instinct told him to say nothing.</w:t>
       </w:r>
     </w:p>
     <w:p>
@@ -1898,7 +1898,7 @@
     </w:p>
     <w:p>
       <w:r>
-        <w:t>Inspector Hafiz Rahmat.</w:t>
+        <w:t>Inspector Hafiz Rashid.</w:t>
       </w:r>
     </w:p>
     <w:p>

</xml_diff>

<commit_message>
Use curly apostrophes in Prologue and Ch1-8 to match the rest of the manuscript
Co-Authored-By: Claude Sonnet 5.5 <noreply@anthropic.com>

Claude-Session: https://claude.ai/code/session_011sBVAmX35tPxqRASXqkfKn
</commit_message>
<xml_diff>
--- a/01_The_Blue_Silence/Manuscript/THE_BLUE_SILENCE_Chapter_01_The_Retirement.docx
+++ b/01_The_Blue_Silence/Manuscript/THE_BLUE_SILENCE_Chapter_01_The_Retirement.docx
@@ -33,7 +33,7 @@
     </w:p>
     <w:p>
       <w:r>
-        <w:t>Dato' Rahman Aziz had attended enough retirement ceremonies to know that almost everything said at them was true and almost nothing was complete.</w:t>
+        <w:t>Dato’ Rahman Aziz had attended enough retirement ceremonies to know that almost everything said at them was true and almost nothing was complete.</w:t>
       </w:r>
     </w:p>
     <w:p>
@@ -133,7 +133,7 @@
     </w:p>
     <w:p>
       <w:r>
-        <w:t>“Dato'.”</w:t>
+        <w:t>“Dato’.”</w:t>
       </w:r>
     </w:p>
     <w:p>
@@ -188,7 +188,7 @@
     </w:p>
     <w:p>
       <w:r>
-        <w:t>“You've been promoted. You don't need to look frightened anymore.”</w:t>
+        <w:t>“You’ve been promoted. You don’t need to look frightened anymore.”</w:t>
       </w:r>
     </w:p>
     <w:p>
@@ -213,7 +213,7 @@
     </w:p>
     <w:p>
       <w:r>
-        <w:t>Imran's smile became real.</w:t>
+        <w:t>Imran’s smile became real.</w:t>
       </w:r>
     </w:p>
     <w:p>
@@ -358,7 +358,7 @@
     </w:p>
     <w:p>
       <w:r>
-        <w:t>Farid's smile faded slightly.</w:t>
+        <w:t>Farid’s smile faded slightly.</w:t>
       </w:r>
     </w:p>
     <w:p>
@@ -373,7 +373,7 @@
     </w:p>
     <w:p>
       <w:r>
-        <w:t>“You've heard it before?”</w:t>
+        <w:t>“You’ve heard it before?”</w:t>
       </w:r>
     </w:p>
     <w:p>
@@ -383,7 +383,7 @@
     </w:p>
     <w:p>
       <w:r>
-        <w:t>“I won't.”</w:t>
+        <w:t>“I won’t.”</w:t>
       </w:r>
     </w:p>
     <w:p>
@@ -393,12 +393,12 @@
     </w:p>
     <w:p>
       <w:r>
-        <w:t>“You're not planning to retire?”</w:t>
-      </w:r>
-    </w:p>
-    <w:p>
-      <w:r>
-        <w:t>“I said I won't give the speech.”</w:t>
+        <w:t>“You’re not planning to retire?”</w:t>
+      </w:r>
+    </w:p>
+    <w:p>
+      <w:r>
+        <w:t>“I said I won’t give the speech.”</w:t>
       </w:r>
     </w:p>
     <w:p>
@@ -418,7 +418,7 @@
     </w:p>
     <w:p>
       <w:r>
-        <w:t>“—and officers like Dato' Rahman Aziz remind us that integrity is not an idea printed on the wall. It is something an officer carries every day.”</w:t>
+        <w:t>“—and officers like Dato’ Rahman Aziz remind us that integrity is not an idea printed on the wall. It is something an officer carries every day.”</w:t>
       </w:r>
     </w:p>
     <w:p>
@@ -428,7 +428,7 @@
     </w:p>
     <w:p>
       <w:r>
-        <w:t>Rahman's jaw tightened.</w:t>
+        <w:t>Rahman’s jaw tightened.</w:t>
       </w:r>
     </w:p>
     <w:p>
@@ -473,12 +473,12 @@
     </w:p>
     <w:p>
       <w:r>
-        <w:t>“That's not what he said.”</w:t>
-      </w:r>
-    </w:p>
-    <w:p>
-      <w:r>
-        <w:t>“It's what everyone heard.”</w:t>
+        <w:t>“That’s not what he said.”</w:t>
+      </w:r>
+    </w:p>
+    <w:p>
+      <w:r>
+        <w:t>“It’s what everyone heard.”</w:t>
       </w:r>
     </w:p>
     <w:p>
@@ -518,7 +518,7 @@
     </w:p>
     <w:p>
       <w:r>
-        <w:t>There was humour in Farid's eyes.</w:t>
+        <w:t>There was humour in Farid’s eyes.</w:t>
       </w:r>
     </w:p>
     <w:p>
@@ -573,12 +573,12 @@
     </w:p>
     <w:p>
       <w:r>
-        <w:t>His father's hands adjusting his collar at a bus station in Seri Merbau.</w:t>
-      </w:r>
-    </w:p>
-    <w:p>
-      <w:r>
-        <w:t>If you cannot change the world, don't become another source of its damage.</w:t>
+        <w:t>His father’s hands adjusting his collar at a bus station in Seri Merbau.</w:t>
+      </w:r>
+    </w:p>
+    <w:p>
+      <w:r>
+        <w:t>If you cannot change the world, don’t become another source of its damage.</w:t>
       </w:r>
     </w:p>
     <w:p>
@@ -598,7 +598,7 @@
     </w:p>
     <w:p>
       <w:r>
-        <w:t>Rahman shook hands with retired commissioners, state commanders, ministers' representatives, businessmen, former officers, widows, journalists and people whose exact relationship to the institution was never explained but who somehow attended everything.</w:t>
+        <w:t>Rahman shook hands with retired commissioners, state commanders, ministers’ representatives, businessmen, former officers, widows, journalists and people whose exact relationship to the institution was never explained but who somehow attended everything.</w:t>
       </w:r>
     </w:p>
     <w:p>
@@ -638,7 +638,7 @@
     </w:p>
     <w:p>
       <w:r>
-        <w:t>“You're working?”</w:t>
+        <w:t>“You’re working?”</w:t>
       </w:r>
     </w:p>
     <w:p>
@@ -653,7 +653,7 @@
     </w:p>
     <w:p>
       <w:r>
-        <w:t>“Government editor thinks important people say important things when they're emotional.”</w:t>
+        <w:t>“Government editor thinks important people say important things when they’re emotional.”</w:t>
       </w:r>
     </w:p>
     <w:p>
@@ -738,7 +738,7 @@
     </w:p>
     <w:p>
       <w:r>
-        <w:t>“That isn't what I asked.”</w:t>
+        <w:t>“That isn’t what I asked.”</w:t>
       </w:r>
     </w:p>
     <w:p>
@@ -748,7 +748,7 @@
     </w:p>
     <w:p>
       <w:r>
-        <w:t>At twenty-four, Hana had inherited Mariam's ability to make ordinary questions sound like cross-examination.</w:t>
+        <w:t>At twenty-four, Hana had inherited Mariam’s ability to make ordinary questions sound like cross-examination.</w:t>
       </w:r>
     </w:p>
     <w:p>
@@ -793,7 +793,7 @@
     </w:p>
     <w:p>
       <w:r>
-        <w:t>“She'll be here for lunch.”</w:t>
+        <w:t>“She’ll be here for lunch.”</w:t>
       </w:r>
     </w:p>
     <w:p>
@@ -803,7 +803,7 @@
     </w:p>
     <w:p>
       <w:r>
-        <w:t>“Is it true there'll be senior command changes before the end of the year?”</w:t>
+        <w:t>“Is it true there’ll be senior command changes before the end of the year?”</w:t>
       </w:r>
     </w:p>
     <w:p>
@@ -813,7 +813,7 @@
     </w:p>
     <w:p>
       <w:r>
-        <w:t>“No meaning it isn't true or no meaning you're not answering?”</w:t>
+        <w:t>“No meaning it isn’t true or no meaning you’re not answering?”</w:t>
       </w:r>
     </w:p>
     <w:p>
@@ -868,12 +868,12 @@
     </w:p>
     <w:p>
       <w:r>
-        <w:t>“You're at somebody else's retirement ceremony and they still can't leave you alone?”</w:t>
-      </w:r>
-    </w:p>
-    <w:p>
-      <w:r>
-        <w:t>“The criminals didn't receive the programme.”</w:t>
+        <w:t>“You’re at somebody else’s retirement ceremony and they still can’t leave you alone?”</w:t>
+      </w:r>
+    </w:p>
+    <w:p>
+      <w:r>
+        <w:t>“The criminals didn’t receive the programme.”</w:t>
       </w:r>
     </w:p>
     <w:p>
@@ -883,7 +883,7 @@
     </w:p>
     <w:p>
       <w:r>
-        <w:t>“Don't tell anyone.”</w:t>
+        <w:t>“Don’t tell anyone.”</w:t>
       </w:r>
     </w:p>
     <w:p>
@@ -903,7 +903,7 @@
     </w:p>
     <w:p>
       <w:r>
-        <w:t>Rahman's attention shifted.</w:t>
+        <w:t>Rahman’s attention shifted.</w:t>
       </w:r>
     </w:p>
     <w:p>
@@ -963,7 +963,7 @@
     </w:p>
     <w:p>
       <w:r>
-        <w:t>Across the parade ground, near the visitors' gate, an old man stood alone.</w:t>
+        <w:t>Across the parade ground, near the visitors’ gate, an old man stood alone.</w:t>
       </w:r>
     </w:p>
     <w:p>
@@ -1028,7 +1028,7 @@
     </w:p>
     <w:p>
       <w:r>
-        <w:t>Something about the man's face disturbed him.</w:t>
+        <w:t>Something about the man’s face disturbed him.</w:t>
       </w:r>
     </w:p>
     <w:p>
@@ -1113,7 +1113,7 @@
     </w:p>
     <w:p>
       <w:r>
-        <w:t>“Dato', lunch is—”</w:t>
+        <w:t>“Dato’, lunch is—”</w:t>
       </w:r>
     </w:p>
     <w:p>
@@ -1168,7 +1168,7 @@
     </w:p>
     <w:p>
       <w:r>
-        <w:t>The visitors' gate stood open behind two uniformed guards.</w:t>
+        <w:t>The visitors’ gate stood open behind two uniformed guards.</w:t>
       </w:r>
     </w:p>
     <w:p>
@@ -1208,7 +1208,7 @@
     </w:p>
     <w:p>
       <w:r>
-        <w:t>“Which gentleman, Dato'?”</w:t>
+        <w:t>“Which gentleman, Dato’?”</w:t>
       </w:r>
     </w:p>
     <w:p>
@@ -1228,7 +1228,7 @@
     </w:p>
     <w:p>
       <w:r>
-        <w:t>“If I knew that, I wouldn't be asking.”</w:t>
+        <w:t>“If I knew that, I wouldn’t be asking.”</w:t>
       </w:r>
     </w:p>
     <w:p>
@@ -1248,7 +1248,7 @@
     </w:p>
     <w:p>
       <w:r>
-        <w:t>“You're sure?”</w:t>
+        <w:t>“You’re sure?”</w:t>
       </w:r>
     </w:p>
     <w:p>
@@ -1356,7 +1356,7 @@
     </w:p>
     <w:p>
       <w:r>
-        <w:t>Rahman's expression changed.</w:t>
+        <w:t>Rahman’s expression changed.</w:t>
       </w:r>
     </w:p>
     <w:p>
@@ -1443,7 +1443,7 @@
     </w:p>
     <w:p>
       <w:r>
-        <w:t>Farid's face revealed nothing.</w:t>
+        <w:t>Farid’s face revealed nothing.</w:t>
       </w:r>
     </w:p>
     <w:p>
@@ -1458,7 +1458,7 @@
     </w:p>
     <w:p>
       <w:r>
-        <w:t>“Everything all right, Dato'?” the guard asked.</w:t>
+        <w:t>“Everything all right, Dato’?” the guard asked.</w:t>
       </w:r>
     </w:p>
     <w:p>
@@ -1513,12 +1513,12 @@
     </w:p>
     <w:p>
       <w:r>
-        <w:t>“You'll survive.”</w:t>
-      </w:r>
-    </w:p>
-    <w:p>
-      <w:r>
-        <w:t>“That's very reassuring.”</w:t>
+        <w:t>“You’ll survive.”</w:t>
+      </w:r>
+    </w:p>
+    <w:p>
+      <w:r>
+        <w:t>“That’s very reassuring.”</w:t>
       </w:r>
     </w:p>
     <w:p>
@@ -1578,7 +1578,7 @@
     </w:p>
     <w:p>
       <w:r>
-        <w:t>“I don't know yet.”</w:t>
+        <w:t>“I don’t know yet.”</w:t>
       </w:r>
     </w:p>
     <w:p>
@@ -1598,12 +1598,12 @@
     </w:p>
     <w:p>
       <w:r>
-        <w:t>“I'll call your mother.”</w:t>
-      </w:r>
-    </w:p>
-    <w:p>
-      <w:r>
-        <w:t>“You mean you'll message her four hours from now after she calls me asking where you are.”</w:t>
+        <w:t>“I’ll call your mother.”</w:t>
+      </w:r>
+    </w:p>
+    <w:p>
+      <w:r>
+        <w:t>“You mean you’ll message her four hours from now after she calls me asking where you are.”</w:t>
       </w:r>
     </w:p>
     <w:p>
@@ -1698,7 +1698,7 @@
     </w:p>
     <w:p>
       <w:r>
-        <w:t>“Any watch with wireless capability, Dato'?”</w:t>
+        <w:t>“Any watch with wireless capability, Dato’?”</w:t>
       </w:r>
     </w:p>
     <w:p>
@@ -1733,7 +1733,7 @@
     </w:p>
     <w:p>
       <w:r>
-        <w:t>“Sorry, Dato'.”</w:t>
+        <w:t>“Sorry, Dato’.”</w:t>
       </w:r>
     </w:p>
     <w:p>
@@ -2113,7 +2113,7 @@
     </w:p>
     <w:p>
       <w:r>
-        <w:t>“Because it's worse than that.”</w:t>
+        <w:t>“Because it’s worse than that.”</w:t>
       </w:r>
     </w:p>
     <w:p>
@@ -2168,7 +2168,7 @@
     </w:p>
     <w:p>
       <w:r>
-        <w:t>“Somebody accessed information they weren't supposed to know existed.”</w:t>
+        <w:t>“Somebody accessed information they weren’t supposed to know existed.”</w:t>
       </w:r>
     </w:p>
     <w:p>
@@ -2228,7 +2228,7 @@
     </w:p>
     <w:p>
       <w:r>
-        <w:t>Rahman felt Harun's voice again, thirty years old and perfectly clear.</w:t>
+        <w:t>Rahman felt Harun’s voice again, thirty years old and perfectly clear.</w:t>
       </w:r>
     </w:p>
     <w:p>
@@ -2284,7 +2284,7 @@
     </w:p>
     <w:p>
       <w:r>
-        <w:t>“Because if we are right, the people you're investigating may include police officers.”</w:t>
+        <w:t>“Because if we are right, the people you’re investigating may include police officers.”</w:t>
       </w:r>
     </w:p>
     <w:p>
@@ -2299,7 +2299,7 @@
     </w:p>
     <w:p>
       <w:r>
-        <w:t>Rahman's eyes moved slowly around the table.</w:t>
+        <w:t>Rahman’s eyes moved slowly around the table.</w:t>
       </w:r>
     </w:p>
     <w:p>
@@ -2424,7 +2424,7 @@
     </w:p>
     <w:p>
       <w:r>
-        <w:t>Rahman thought of the grey-haired man at the visitors' gate.</w:t>
+        <w:t>Rahman thought of the grey-haired man at the visitors’ gate.</w:t>
       </w:r>
     </w:p>
     <w:p>
@@ -2444,7 +2444,7 @@
     </w:p>
     <w:p>
       <w:r>
-        <w:t>“Dato'.”</w:t>
+        <w:t>“Dato’.”</w:t>
       </w:r>
     </w:p>
     <w:p>

</xml_diff>

<commit_message>
Audit fixes: continuity (A), three planted beats (B), opener and ending variety (C1, C2)
Co-Authored-By: Claude Sonnet 5.5 <noreply@anthropic.com>

Claude-Session: https://claude.ai/code/session_011sBVAmX35tPxqRASXqkfKn
</commit_message>
<xml_diff>
--- a/01_The_Blue_Silence/Manuscript/THE_BLUE_SILENCE_Chapter_01_The_Retirement.docx
+++ b/01_The_Blue_Silence/Manuscript/THE_BLUE_SILENCE_Chapter_01_The_Retirement.docx
@@ -143,7 +143,7 @@
     </w:p>
     <w:p>
       <w:r>
-        <w:t>Inspector Imran Faiz stood half a step behind him, rigid enough to appear physically uncomfortable.</w:t>
+        <w:t>Inspector Imran Taib stood half a step behind him, rigid enough to appear physically uncomfortable.</w:t>
       </w:r>
     </w:p>
     <w:p>
@@ -278,7 +278,7 @@
     </w:p>
     <w:p>
       <w:r>
-        <w:t>At fifty-eight, Farid still wore a ceremonial uniform as though it had been tailored around his posture. His silver hair was cut short. His expression carried the relaxed amusement of a man who rarely appeared hurried because he had learned long ago that making other people wait was its own form of authority.</w:t>
+        <w:t>At sixty-six, Farid still wore a ceremonial uniform as though it had been tailored around his posture. His silver hair was cut short. His expression carried the relaxed amusement of a man who rarely appeared hurried because he had learned long ago that making other people wait was its own form of authority.</w:t>
       </w:r>
     </w:p>
     <w:p>

</xml_diff>